<commit_message>
Revista ANPEGE - Template manuscrito
Template atualizado em maio de 2026.
</commit_message>
<xml_diff>
--- a/RA_Template_manuscrito_atual_maio26.docx
+++ b/RA_Template_manuscrito_atual_maio26.docx
@@ -381,17 +381,38 @@
     </w:p>
     <w:p>
       <w:pPr>
+        <w:spacing w:line="240" w:lineRule="auto"/>
+        <w:jc w:val="left"/>
+        <w:rPr>
+          <w:b/>
+          <w:i/>
+          <w:snapToGrid w:val="0"/>
+          <w:szCs w:val="22"/>
+          <w:lang w:eastAsia="zh-CN" w:bidi="en-US"/>
+        </w:rPr>
+      </w:pPr>
+      <w:r>
+        <w:rPr>
+          <w:lang w:eastAsia="zh-CN"/>
+        </w:rPr>
+        <w:br w:type="page"/>
+      </w:r>
+    </w:p>
+    <w:p>
+      <w:pPr>
         <w:pStyle w:val="RA21heading1"/>
         <w:spacing w:before="480"/>
         <w:rPr>
           <w:lang w:val="pt-BR" w:eastAsia="zh-CN"/>
         </w:rPr>
       </w:pPr>
+      <w:commentRangeStart w:id="0"/>
       <w:r>
         <w:rPr>
           <w:highlight w:val="yellow"/>
           <w:lang w:val="pt-BR" w:eastAsia="zh-CN"/>
         </w:rPr>
+        <w:lastRenderedPageBreak/>
         <w:t xml:space="preserve">Como usar este </w:t>
       </w:r>
       <w:r>
@@ -553,7 +574,6 @@
         <w:rPr>
           <w:lang w:val="pt-BR"/>
         </w:rPr>
-        <w:lastRenderedPageBreak/>
         <w:t>Formatação geral: utilizar os estilos disponíveis no menu “Estilos”. Por exemplo, usar o estilo “RA_3.1.text” no corpo do texto. Todas as margens devem ter 2,5 cm.</w:t>
       </w:r>
     </w:p>
@@ -595,6 +615,16 @@
           <w:lang w:val="pt-BR"/>
         </w:rPr>
         <w:t>Quando for necessário citar trabalhos da própria autoria durante a avaliação, substitua o nome por “Autor(a), ano” no texto e retire temporariamente a referência correspondente da lista final de referências. Após o aceite, as autocitações e as referências completas deverão ser reinseridas.</w:t>
+      </w:r>
+      <w:commentRangeEnd w:id="0"/>
+      <w:r>
+        <w:rPr>
+          <w:rStyle w:val="Refdecomentrio"/>
+          <w:sz w:val="20"/>
+          <w:szCs w:val="22"/>
+          <w:lang w:val="pt-BR"/>
+        </w:rPr>
+        <w:commentReference w:id="0"/>
       </w:r>
     </w:p>
     <w:p>
@@ -894,7 +924,7 @@
                           </pic:cNvPicPr>
                         </pic:nvPicPr>
                         <pic:blipFill>
-                          <a:blip r:embed="rId13" cstate="print">
+                          <a:blip r:embed="rId16" cstate="print">
                             <a:extLst>
                               <a:ext uri="{28A0092B-C50C-407E-A947-70E740481C1C}">
                                 <a14:useLocalDpi xmlns:a14="http://schemas.microsoft.com/office/drawing/2010/main" val="0"/>
@@ -939,7 +969,7 @@
                 <w:rFonts w:eastAsia="SimSun"/>
               </w:rPr>
             </w:pPr>
-            <w:hyperlink r:id="rId14" w:history="1">
+            <w:hyperlink r:id="rId17" w:history="1">
               <w:r>
                 <w:rPr>
                   <w:rStyle w:val="Hyperlink"/>
@@ -1007,8 +1037,8 @@
           <w:lang w:val="pt-BR" w:eastAsia="pt-BR"/>
         </w:rPr>
       </w:pPr>
-      <w:bookmarkStart w:id="0" w:name="OLE_LINK1"/>
-      <w:bookmarkStart w:id="1" w:name="OLE_LINK2"/>
+      <w:bookmarkStart w:id="1" w:name="OLE_LINK1"/>
+      <w:bookmarkStart w:id="2" w:name="OLE_LINK2"/>
       <w:r>
         <w:rPr>
           <w:lang w:val="pt-BR"/>
@@ -1077,7 +1107,30 @@
         <w:rPr>
           <w:lang w:val="pt-BR"/>
         </w:rPr>
-        <w:t>A originalidade do estudo deve estar claramente indicada, podendo assumir caráter teórico, metodológico, empírico ou interpretativo. A Introdução deve demonstrar coerência entre o problema, o referencial teórico e a abordagem metodológica, assegurando consistência epistemológica ao longo do manuscrito. A seção deve conduzir de forma lógica à explicitação do objetivo principal do trabalho, que deve ser apresentado ao final da Introdução. Todas as obras citadas devem constar na lista de referências ao final do manuscrito, organizada em ordem alfabética, conforme as normas da revista.</w:t>
+        <w:t>A originalidade do estudo deve estar claramente indicada, podendo assumir caráter teórico, metodológico, empírico ou interpretativo. A Introdução deve demonstrar coerência entre o problema, o referencial teórico e a abordagem metodológica, assegurando consistência epistemológica ao longo do manuscrito. A seção deve conduzir de forma lógica à explicitação do objetivo principal do trabalho, que deve ser apresentado ao final da Introdução. Todas as obras citadas devem constar na lista de referências ao final do manuscrito, organizada em ordem alfabética, conforme as normas da revista</w:t>
+      </w:r>
+    </w:p>
+    <w:p>
+      <w:pPr>
+        <w:pStyle w:val="RA37citaorecuada"/>
+      </w:pPr>
+      <w:r>
+        <w:t xml:space="preserve">Citações diretas com </w:t>
+      </w:r>
+      <w:r>
+        <w:t>três</w:t>
+      </w:r>
+      <w:r>
+        <w:t xml:space="preserve"> linhas ou mais devem ser destacadas em parágrafo próprio, com recuo de 4 cm da margem esquerda, fonte </w:t>
+      </w:r>
+      <w:r>
+        <w:t>deve apresentar t</w:t>
+      </w:r>
+      <w:r>
+        <w:t>amanho 9, espaçamento simples e sem aspas. A indicação da fonte deve seguir o sistema autor-data, com sobrenome, ano e página, conforme a ABNT NBR 10520:2023</w:t>
+      </w:r>
+      <w:r>
+        <w:t>.</w:t>
       </w:r>
     </w:p>
     <w:p>
@@ -1189,8 +1242,8 @@
         <w:t>.</w:t>
       </w:r>
     </w:p>
-    <w:bookmarkEnd w:id="0"/>
     <w:bookmarkEnd w:id="1"/>
+    <w:bookmarkEnd w:id="2"/>
     <w:p>
       <w:pPr>
         <w:pStyle w:val="RA21heading1"/>
@@ -1261,6 +1314,7 @@
         <w:rPr>
           <w:lang w:val="pt-BR"/>
         </w:rPr>
+        <w:lastRenderedPageBreak/>
         <w:t>Quando presente, a seção deve descrever</w:t>
       </w:r>
       <w:r>
@@ -1285,14 +1339,7 @@
         <w:rPr>
           <w:lang w:val="pt-BR"/>
         </w:rPr>
-        <w:t xml:space="preserve"> os procedimentos adotados para responder ao problema de pesquisa e alcançar o objetivo proposto, mantendo coerência entre o referencial teórico, a abordagem </w:t>
-      </w:r>
-      <w:r>
-        <w:rPr>
-          <w:lang w:val="pt-BR"/>
-        </w:rPr>
-        <w:lastRenderedPageBreak/>
-        <w:t>metodológica e a escala de análise. Devem ser explicitados, quando pertinentes: (i) o desenho da pesquisa e a abordagem (qualitativa, quantitativa, mista, cartográfica, documental, etnográfica etc.); (ii) o recorte espacial e temporal e os critérios de seleção da área, dos sujeitos e/ou das fontes; (iii) as fontes e bases de dados (primárias e secundárias), bem como os procedimentos de coleta/produção de dados; (iv) as etapas de tratamento e análise, incluindo parâmetros, técnicas, softwares (e versões, quando relevante) e procedimentos de validação/controle de qualidade.</w:t>
+        <w:t xml:space="preserve"> os procedimentos adotados para responder ao problema de pesquisa e alcançar o objetivo proposto, mantendo coerência entre o referencial teórico, a abordagem metodológica e a escala de análise. Devem ser explicitados, quando pertinentes: (i) o desenho da pesquisa e a abordagem (qualitativa, quantitativa, mista, cartográfica, documental, etnográfica etc.); (ii) o recorte espacial e temporal e os critérios de seleção da área, dos sujeitos e/ou das fontes; (iii) as fontes e bases de dados (primárias e secundárias), bem como os procedimentos de coleta/produção de dados; (iv) as etapas de tratamento e análise, incluindo parâmetros, técnicas, softwares (e versões, quando relevante) e procedimentos de validação/controle de qualidade.</w:t>
       </w:r>
     </w:p>
     <w:p>
@@ -1358,7 +1405,7 @@
           <w:lang w:val="pt-BR"/>
         </w:rPr>
       </w:pPr>
-      <w:bookmarkStart w:id="2" w:name="OLE_LINK3"/>
+      <w:bookmarkStart w:id="3" w:name="OLE_LINK3"/>
       <w:r>
         <w:rPr>
           <w:lang w:val="pt-BR"/>
@@ -2007,7 +2054,7 @@
                           </pic:cNvPicPr>
                         </pic:nvPicPr>
                         <pic:blipFill>
-                          <a:blip r:embed="rId15" cstate="print">
+                          <a:blip r:embed="rId18" cstate="print">
                             <a:extLst>
                               <a:ext uri="{28A0092B-C50C-407E-A947-70E740481C1C}">
                                 <a14:useLocalDpi xmlns:a14="http://schemas.microsoft.com/office/drawing/2010/main" val="0"/>
@@ -2036,7 +2083,7 @@
                           </pic:cNvPicPr>
                         </pic:nvPicPr>
                         <pic:blipFill>
-                          <a:blip r:embed="rId16">
+                          <a:blip r:embed="rId19">
                             <a:extLst>
                               <a:ext uri="{28A0092B-C50C-407E-A947-70E740481C1C}">
                                 <a14:useLocalDpi xmlns:a14="http://schemas.microsoft.com/office/drawing/2010/main" val="0"/>
@@ -2091,10 +2138,10 @@
                   <o:lock v:ext="edit" aspectratio="t"/>
                 </v:shapetype>
                 <v:shape id="Imagem 1210125007" o:spid="_x0000_s1027" type="#_x0000_t75" alt="Logotipo, nome da empresa&#10;&#10;Descrição gerada automaticamente" style="position:absolute;width:49688;height:15411;visibility:visible;mso-wrap-style:square" o:gfxdata="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">
-                  <v:imagedata r:id="rId17" o:title="Logotipo, nome da empresa&#10;&#10;Descrição gerada automaticamente"/>
+                  <v:imagedata r:id="rId20" o:title="Logotipo, nome da empresa&#10;&#10;Descrição gerada automaticamente"/>
                 </v:shape>
                 <v:shape id="Imagem 3" o:spid="_x0000_s1028" type="#_x0000_t75" alt="Logotipo, nome da empresa&#10;&#10;O conteúdo gerado por IA pode estar incorreto." style="position:absolute;top:845;width:23431;height:13100;visibility:visible;mso-wrap-style:square" o:gfxdata="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">
-                  <v:imagedata r:id="rId18" o:title="Logotipo, nome da empresa&#10;&#10;O conteúdo gerado por IA pode estar incorreto"/>
+                  <v:imagedata r:id="rId21" o:title="Logotipo, nome da empresa&#10;&#10;O conteúdo gerado por IA pode estar incorreto"/>
                 </v:shape>
                 <w10:wrap type="topAndBottom" anchorx="margin" anchory="margin"/>
               </v:group>
@@ -3063,7 +3110,7 @@
         </w:rPr>
         <w:t xml:space="preserve"> Para uma lista de escalas de cores legíveis para um número significativo de leitores, por favor, veja as opções de combinações de cores no ColorBrewer 2.0 (</w:t>
       </w:r>
-      <w:hyperlink r:id="rId19" w:history="1">
+      <w:hyperlink r:id="rId22" w:history="1">
         <w:r>
           <w:rPr>
             <w:rStyle w:val="Hyperlink"/>
@@ -3351,7 +3398,7 @@
         <w:t>Por favor, use apenas uma família de fontes em suas figuras (por exemplo, Palatino Linotype ou Times New Roman).</w:t>
       </w:r>
     </w:p>
-    <w:bookmarkEnd w:id="2"/>
+    <w:bookmarkEnd w:id="3"/>
     <w:p>
       <w:pPr>
         <w:pStyle w:val="RA22heading2"/>
@@ -4547,7 +4594,220 @@
           <w:highlight w:val="yellow"/>
           <w:lang w:val="pt-BR"/>
         </w:rPr>
-        <w:t>Seção obrigatória</w:t>
+        <w:t>Seção obrigatória já na submissão para avaliação</w:t>
+      </w:r>
+      <w:r>
+        <w:rPr>
+          <w:color w:val="FF0000"/>
+          <w:highlight w:val="yellow"/>
+          <w:lang w:val="pt-BR"/>
+        </w:rPr>
+        <w:t>.</w:t>
+      </w:r>
+      <w:r>
+        <w:rPr>
+          <w:color w:val="FF0000"/>
+          <w:highlight w:val="yellow"/>
+          <w:lang w:val="pt-BR"/>
+        </w:rPr>
+        <w:t xml:space="preserve"> </w:t>
+      </w:r>
+      <w:r>
+        <w:rPr>
+          <w:color w:val="FF0000"/>
+          <w:highlight w:val="yellow"/>
+          <w:lang w:val="pt-BR"/>
+        </w:rPr>
+        <w:t>R</w:t>
+      </w:r>
+      <w:r>
+        <w:rPr>
+          <w:color w:val="FF0000"/>
+          <w:highlight w:val="yellow"/>
+          <w:lang w:val="pt-BR"/>
+        </w:rPr>
+        <w:t>etir</w:t>
+      </w:r>
+      <w:r>
+        <w:rPr>
+          <w:color w:val="FF0000"/>
+          <w:highlight w:val="yellow"/>
+          <w:lang w:val="pt-BR"/>
+        </w:rPr>
+        <w:t>e</w:t>
+      </w:r>
+      <w:r>
+        <w:rPr>
+          <w:color w:val="FF0000"/>
+          <w:highlight w:val="yellow"/>
+          <w:lang w:val="pt-BR"/>
+        </w:rPr>
+        <w:t xml:space="preserve"> o grifo em amarelo após preencher</w:t>
+      </w:r>
+      <w:r>
+        <w:rPr>
+          <w:color w:val="FF0000"/>
+          <w:highlight w:val="yellow"/>
+          <w:lang w:val="pt-BR"/>
+        </w:rPr>
+        <w:t xml:space="preserve"> a seção</w:t>
+      </w:r>
+      <w:r>
+        <w:rPr>
+          <w:color w:val="FF0000"/>
+          <w:highlight w:val="yellow"/>
+          <w:lang w:val="pt-BR"/>
+        </w:rPr>
+        <w:t>.</w:t>
+      </w:r>
+    </w:p>
+    <w:p>
+      <w:pPr>
+        <w:pStyle w:val="RA62Acknowledgments"/>
+        <w:rPr>
+          <w:b/>
+          <w:bCs/>
+          <w:lang w:val="pt-BR"/>
+        </w:rPr>
+      </w:pPr>
+      <w:r>
+        <w:rPr>
+          <w:b/>
+          <w:bCs/>
+          <w:highlight w:val="yellow"/>
+          <w:lang w:val="pt-BR"/>
+        </w:rPr>
+        <w:t>Conflito de interesse</w:t>
+      </w:r>
+      <w:r>
+        <w:rPr>
+          <w:b/>
+          <w:bCs/>
+          <w:highlight w:val="yellow"/>
+          <w:lang w:val="pt-BR"/>
+        </w:rPr>
+        <w:t>s</w:t>
+      </w:r>
+      <w:r>
+        <w:rPr>
+          <w:b/>
+          <w:bCs/>
+          <w:highlight w:val="yellow"/>
+          <w:lang w:val="pt-BR"/>
+        </w:rPr>
+        <w:t>:</w:t>
+      </w:r>
+      <w:r>
+        <w:rPr>
+          <w:highlight w:val="yellow"/>
+          <w:lang w:val="pt-BR"/>
+        </w:rPr>
+        <w:t xml:space="preserve"> os autores devem declarar conflitos de interesse existentes ou, na ausência, declarar: “Os autores declaram não haver conflito de interesse</w:t>
+      </w:r>
+      <w:r>
+        <w:rPr>
+          <w:highlight w:val="yellow"/>
+          <w:lang w:val="pt-BR"/>
+        </w:rPr>
+        <w:t>s</w:t>
+      </w:r>
+      <w:r>
+        <w:rPr>
+          <w:highlight w:val="yellow"/>
+          <w:lang w:val="pt-BR"/>
+        </w:rPr>
+        <w:t>”</w:t>
+      </w:r>
+      <w:r>
+        <w:rPr>
+          <w:highlight w:val="yellow"/>
+          <w:lang w:val="pt-BR"/>
+        </w:rPr>
+        <w:t>.</w:t>
+      </w:r>
+      <w:r>
+        <w:rPr>
+          <w:highlight w:val="yellow"/>
+          <w:lang w:val="pt-BR"/>
+        </w:rPr>
+        <w:t xml:space="preserve"> Devem ser informadas quaisquer circunstâncias que possam ser percebidas como influenciando indevidamente a condução, a análise, a interpretação ou a comunicação dos resultados. Caso haja financiadores, deve-se declarar </w:t>
+      </w:r>
+      <w:r>
+        <w:rPr>
+          <w:highlight w:val="yellow"/>
+          <w:lang w:val="pt-BR"/>
+        </w:rPr>
+        <w:t xml:space="preserve">a </w:t>
+      </w:r>
+      <w:r>
+        <w:rPr>
+          <w:highlight w:val="yellow"/>
+          <w:lang w:val="pt-BR"/>
+        </w:rPr>
+        <w:t>eventual participação destes na concepção do estudo, na coleta</w:t>
+      </w:r>
+      <w:r>
+        <w:rPr>
+          <w:highlight w:val="yellow"/>
+          <w:lang w:val="pt-BR"/>
+        </w:rPr>
+        <w:t xml:space="preserve"> e </w:t>
+      </w:r>
+      <w:r>
+        <w:rPr>
+          <w:highlight w:val="yellow"/>
+          <w:lang w:val="pt-BR"/>
+        </w:rPr>
+        <w:t xml:space="preserve">na </w:t>
+      </w:r>
+      <w:r>
+        <w:rPr>
+          <w:highlight w:val="yellow"/>
+          <w:lang w:val="pt-BR"/>
+        </w:rPr>
+        <w:t>produção de dados, na análise</w:t>
+      </w:r>
+      <w:r>
+        <w:rPr>
+          <w:highlight w:val="yellow"/>
+          <w:lang w:val="pt-BR"/>
+        </w:rPr>
+        <w:t xml:space="preserve"> e</w:t>
+      </w:r>
+      <w:r>
+        <w:rPr>
+          <w:highlight w:val="yellow"/>
+          <w:lang w:val="pt-BR"/>
+        </w:rPr>
+        <w:t xml:space="preserve"> na</w:t>
+      </w:r>
+      <w:r>
+        <w:rPr>
+          <w:highlight w:val="yellow"/>
+          <w:lang w:val="pt-BR"/>
+        </w:rPr>
+        <w:t xml:space="preserve"> </w:t>
+      </w:r>
+      <w:r>
+        <w:rPr>
+          <w:highlight w:val="yellow"/>
+          <w:lang w:val="pt-BR"/>
+        </w:rPr>
+        <w:t>interpretação, na redação do manuscrito ou na decisão de publicar. Na ausência de interferência, declarar: “Os financiadores não tiveram interferência na concepção do estudo; na coleta/produção, análise ou interpretação dos dados; na redação do manuscrito; ou na decisão de publicar os resultados”</w:t>
+      </w:r>
+      <w:r>
+        <w:rPr>
+          <w:highlight w:val="yellow"/>
+          <w:lang w:val="pt-BR"/>
+        </w:rPr>
+        <w:t>.</w:t>
+      </w:r>
+      <w:r>
+        <w:rPr>
+          <w:highlight w:val="yellow"/>
+          <w:lang w:val="pt-BR"/>
+        </w:rPr>
+        <w:t xml:space="preserve"> </w:t>
       </w:r>
       <w:r>
         <w:rPr>
@@ -4557,229 +4817,6 @@
           <w:highlight w:val="yellow"/>
           <w:lang w:val="pt-BR"/>
         </w:rPr>
-        <w:t xml:space="preserve"> já na submissão para avaliação</w:t>
-      </w:r>
-      <w:r>
-        <w:rPr>
-          <w:color w:val="FF0000"/>
-          <w:highlight w:val="yellow"/>
-          <w:lang w:val="pt-BR"/>
-        </w:rPr>
-        <w:t>.</w:t>
-      </w:r>
-      <w:r>
-        <w:rPr>
-          <w:color w:val="FF0000"/>
-          <w:highlight w:val="yellow"/>
-          <w:lang w:val="pt-BR"/>
-        </w:rPr>
-        <w:t xml:space="preserve"> </w:t>
-      </w:r>
-      <w:r>
-        <w:rPr>
-          <w:color w:val="FF0000"/>
-          <w:highlight w:val="yellow"/>
-          <w:lang w:val="pt-BR"/>
-        </w:rPr>
-        <w:t>R</w:t>
-      </w:r>
-      <w:r>
-        <w:rPr>
-          <w:color w:val="FF0000"/>
-          <w:highlight w:val="yellow"/>
-          <w:lang w:val="pt-BR"/>
-        </w:rPr>
-        <w:t>etir</w:t>
-      </w:r>
-      <w:r>
-        <w:rPr>
-          <w:color w:val="FF0000"/>
-          <w:highlight w:val="yellow"/>
-          <w:lang w:val="pt-BR"/>
-        </w:rPr>
-        <w:t>e</w:t>
-      </w:r>
-      <w:r>
-        <w:rPr>
-          <w:color w:val="FF0000"/>
-          <w:highlight w:val="yellow"/>
-          <w:lang w:val="pt-BR"/>
-        </w:rPr>
-        <w:t xml:space="preserve"> o grifo em amarelo após preencher</w:t>
-      </w:r>
-      <w:r>
-        <w:rPr>
-          <w:color w:val="FF0000"/>
-          <w:highlight w:val="yellow"/>
-          <w:lang w:val="pt-BR"/>
-        </w:rPr>
-        <w:t xml:space="preserve"> a seção</w:t>
-      </w:r>
-      <w:r>
-        <w:rPr>
-          <w:color w:val="FF0000"/>
-          <w:highlight w:val="yellow"/>
-          <w:lang w:val="pt-BR"/>
-        </w:rPr>
-        <w:t>.</w:t>
-      </w:r>
-    </w:p>
-    <w:p>
-      <w:pPr>
-        <w:pStyle w:val="RA62Acknowledgments"/>
-        <w:rPr>
-          <w:b/>
-          <w:bCs/>
-          <w:lang w:val="pt-BR"/>
-        </w:rPr>
-      </w:pPr>
-      <w:r>
-        <w:rPr>
-          <w:b/>
-          <w:bCs/>
-          <w:highlight w:val="yellow"/>
-          <w:lang w:val="pt-BR"/>
-        </w:rPr>
-        <w:t>Conflito de interesse</w:t>
-      </w:r>
-      <w:r>
-        <w:rPr>
-          <w:b/>
-          <w:bCs/>
-          <w:highlight w:val="yellow"/>
-          <w:lang w:val="pt-BR"/>
-        </w:rPr>
-        <w:t>s</w:t>
-      </w:r>
-      <w:r>
-        <w:rPr>
-          <w:b/>
-          <w:bCs/>
-          <w:highlight w:val="yellow"/>
-          <w:lang w:val="pt-BR"/>
-        </w:rPr>
-        <w:t>:</w:t>
-      </w:r>
-      <w:r>
-        <w:rPr>
-          <w:highlight w:val="yellow"/>
-          <w:lang w:val="pt-BR"/>
-        </w:rPr>
-        <w:t xml:space="preserve"> os autores devem declarar conflitos de interesse existentes ou, na ausência, declarar: “Os autores declaram não haver conflito de interesse</w:t>
-      </w:r>
-      <w:r>
-        <w:rPr>
-          <w:highlight w:val="yellow"/>
-          <w:lang w:val="pt-BR"/>
-        </w:rPr>
-        <w:t>s</w:t>
-      </w:r>
-      <w:r>
-        <w:rPr>
-          <w:highlight w:val="yellow"/>
-          <w:lang w:val="pt-BR"/>
-        </w:rPr>
-        <w:t>”</w:t>
-      </w:r>
-      <w:r>
-        <w:rPr>
-          <w:highlight w:val="yellow"/>
-          <w:lang w:val="pt-BR"/>
-        </w:rPr>
-        <w:t>.</w:t>
-      </w:r>
-      <w:r>
-        <w:rPr>
-          <w:highlight w:val="yellow"/>
-          <w:lang w:val="pt-BR"/>
-        </w:rPr>
-        <w:t xml:space="preserve"> Devem ser informadas quaisquer circunstâncias que possam ser percebidas como influenciando indevidamente a condução, a análise, a interpretação ou a comunicação dos resultados. Caso haja financiadores, deve-se declarar </w:t>
-      </w:r>
-      <w:r>
-        <w:rPr>
-          <w:highlight w:val="yellow"/>
-          <w:lang w:val="pt-BR"/>
-        </w:rPr>
-        <w:t xml:space="preserve">a </w:t>
-      </w:r>
-      <w:r>
-        <w:rPr>
-          <w:highlight w:val="yellow"/>
-          <w:lang w:val="pt-BR"/>
-        </w:rPr>
-        <w:t>eventual participação destes na concepção do estudo, na coleta</w:t>
-      </w:r>
-      <w:r>
-        <w:rPr>
-          <w:highlight w:val="yellow"/>
-          <w:lang w:val="pt-BR"/>
-        </w:rPr>
-        <w:t xml:space="preserve"> e </w:t>
-      </w:r>
-      <w:r>
-        <w:rPr>
-          <w:highlight w:val="yellow"/>
-          <w:lang w:val="pt-BR"/>
-        </w:rPr>
-        <w:t xml:space="preserve">na </w:t>
-      </w:r>
-      <w:r>
-        <w:rPr>
-          <w:highlight w:val="yellow"/>
-          <w:lang w:val="pt-BR"/>
-        </w:rPr>
-        <w:t>produção de dados, na análise</w:t>
-      </w:r>
-      <w:r>
-        <w:rPr>
-          <w:highlight w:val="yellow"/>
-          <w:lang w:val="pt-BR"/>
-        </w:rPr>
-        <w:t xml:space="preserve"> e</w:t>
-      </w:r>
-      <w:r>
-        <w:rPr>
-          <w:highlight w:val="yellow"/>
-          <w:lang w:val="pt-BR"/>
-        </w:rPr>
-        <w:t xml:space="preserve"> na</w:t>
-      </w:r>
-      <w:r>
-        <w:rPr>
-          <w:highlight w:val="yellow"/>
-          <w:lang w:val="pt-BR"/>
-        </w:rPr>
-        <w:t xml:space="preserve"> </w:t>
-      </w:r>
-      <w:r>
-        <w:rPr>
-          <w:highlight w:val="yellow"/>
-          <w:lang w:val="pt-BR"/>
-        </w:rPr>
-        <w:t>interpretação, na redação do manuscrito ou na decisão de publicar. Na ausência de interferência, declarar: “Os financiadores não tiveram interferência na concepção do estudo; na coleta/produção, análise ou interpretação dos dados; na redação do manuscrito; ou na decisão de publicar os resultados”</w:t>
-      </w:r>
-      <w:r>
-        <w:rPr>
-          <w:highlight w:val="yellow"/>
-          <w:lang w:val="pt-BR"/>
-        </w:rPr>
-        <w:t>.</w:t>
-      </w:r>
-      <w:r>
-        <w:rPr>
-          <w:highlight w:val="yellow"/>
-          <w:lang w:val="pt-BR"/>
-        </w:rPr>
-        <w:t xml:space="preserve"> </w:t>
-      </w:r>
-      <w:r>
-        <w:rPr>
-          <w:b/>
-          <w:bCs/>
-          <w:color w:val="EE0000"/>
-          <w:highlight w:val="yellow"/>
-          <w:lang w:val="pt-BR"/>
-        </w:rPr>
         <w:t>Seção obrigatória já na submissão para avaliação</w:t>
       </w:r>
       <w:r>
@@ -4877,6 +4914,12 @@
           <w:lang w:val="pt-BR"/>
         </w:rPr>
       </w:pPr>
+      <w:r>
+        <w:rPr>
+          <w:lang w:val="pt-BR"/>
+        </w:rPr>
+        <w:t>Não usar negrito para destacar os títulos, seguir RA_7.1_References, presente no Painel de Estilos do template.</w:t>
+      </w:r>
     </w:p>
     <w:p>
       <w:pPr>
@@ -4885,6 +4928,14 @@
           <w:lang w:val="pt-BR"/>
         </w:rPr>
       </w:pPr>
+    </w:p>
+    <w:p>
+      <w:pPr>
+        <w:pStyle w:val="RA31text"/>
+        <w:rPr>
+          <w:lang w:val="pt-BR"/>
+        </w:rPr>
+      </w:pPr>
       <w:r>
         <w:rPr>
           <w:lang w:val="pt-BR"/>
@@ -5028,7 +5079,7 @@
           <w:lang w:val="pt-BR"/>
         </w:rPr>
       </w:pPr>
-      <w:bookmarkStart w:id="3" w:name="_Hlk60995131"/>
+      <w:bookmarkStart w:id="4" w:name="_Hlk60995131"/>
       <w:r>
         <w:rPr>
           <w:lang w:val="pt-BR"/>
@@ -5094,7 +5145,7 @@
         <w:t xml:space="preserve"> </w:t>
       </w:r>
     </w:p>
-    <w:bookmarkEnd w:id="3"/>
+    <w:bookmarkEnd w:id="4"/>
     <w:p>
       <w:pPr>
         <w:pStyle w:val="RA71References"/>
@@ -5537,7 +5588,7 @@
       <w:r>
         <w:t xml:space="preserve">ARATTANO, M.; FRANZI, L. On the evaluation of debris flows dynamics by means of mathematical models. Natural Hazards and Earth System Science, v. 3, n. 6, p. 539–544, 2003. </w:t>
       </w:r>
-      <w:hyperlink r:id="rId20" w:history="1">
+      <w:hyperlink r:id="rId23" w:history="1">
         <w:r>
           <w:rPr>
             <w:rStyle w:val="Hyperlink"/>
@@ -5608,7 +5659,7 @@
       <w:r>
         <w:t xml:space="preserve"> </w:t>
       </w:r>
-      <w:hyperlink r:id="rId21" w:history="1">
+      <w:hyperlink r:id="rId24" w:history="1">
         <w:r>
           <w:rPr>
             <w:rStyle w:val="Hyperlink"/>
@@ -6464,7 +6515,7 @@
           <w:lang w:val="pt-BR" w:eastAsia="pt-BR"/>
         </w:rPr>
       </w:pPr>
-      <w:commentRangeStart w:id="4"/>
+      <w:commentRangeStart w:id="5"/>
       <w:r>
         <w:rPr>
           <w:lang w:val="pt-BR"/>
@@ -6685,7 +6736,7 @@
         </w:rPr>
         <w:t>(substituir pelos dados reais):</w:t>
       </w:r>
-      <w:commentRangeEnd w:id="4"/>
+      <w:commentRangeEnd w:id="5"/>
       <w:r>
         <w:rPr>
           <w:rStyle w:val="Refdecomentrio"/>
@@ -6693,7 +6744,7 @@
           <w:szCs w:val="22"/>
           <w:lang w:val="pt-BR"/>
         </w:rPr>
-        <w:commentReference w:id="4"/>
+        <w:commentReference w:id="5"/>
       </w:r>
     </w:p>
     <w:p>
@@ -6995,7 +7046,26 @@
 
 <file path=word/comments.xml><?xml version="1.0" encoding="utf-8"?>
 <w:comments xmlns:wpc="http://schemas.microsoft.com/office/word/2010/wordprocessingCanvas" xmlns:cx="http://schemas.microsoft.com/office/drawing/2014/chartex" xmlns:cx1="http://schemas.microsoft.com/office/drawing/2015/9/8/chartex" xmlns:cx2="http://schemas.microsoft.com/office/drawing/2015/10/21/chartex" xmlns:cx3="http://schemas.microsoft.com/office/drawing/2016/5/9/chartex" xmlns:cx4="http://schemas.microsoft.com/office/drawing/2016/5/10/chartex" xmlns:cx5="http://schemas.microsoft.com/office/drawing/2016/5/11/chartex" xmlns:cx6="http://schemas.microsoft.com/office/drawing/2016/5/12/chartex" xmlns:cx7="http://schemas.microsoft.com/office/drawing/2016/5/13/chartex" xmlns:cx8="http://schemas.microsoft.com/office/drawing/2016/5/14/chartex" xmlns:mc="http://schemas.openxmlformats.org/markup-compatibility/2006" xmlns:aink="http://schemas.microsoft.com/office/drawing/2016/ink" xmlns:am3d="http://schemas.microsoft.com/office/drawing/2017/model3d" xmlns:o="urn:schemas-microsoft-com:office:office" xmlns:oel="http://schemas.microsoft.com/office/2019/extlst" xmlns:r="http://schemas.openxmlformats.org/officeDocument/2006/relationships" xmlns:m="http://schemas.openxmlformats.org/officeDocument/2006/math" xmlns:v="urn:schemas-microsoft-com:vml" xmlns:wp14="http://schemas.microsoft.com/office/word/2010/wordprocessingDrawing" xmlns:wp="http://schemas.openxmlformats.org/drawingml/2006/wordprocessingDrawing" xmlns:w10="urn:schemas-microsoft-com:office:word" xmlns:w="http://schemas.openxmlformats.org/wordprocessingml/2006/main" xmlns:w14="http://schemas.microsoft.com/office/word/2010/wordml" xmlns:w15="http://schemas.microsoft.com/office/word/2012/wordml" xmlns:w16cex="http://schemas.microsoft.com/office/word/2018/wordml/cex" xmlns:w16cid="http://schemas.microsoft.com/office/word/2016/wordml/cid" xmlns:w16="http://schemas.microsoft.com/office/word/2018/wordml" xmlns:w16du="http://schemas.microsoft.com/office/word/2023/wordml/word16du" xmlns:w16sdtdh="http://schemas.microsoft.com/office/word/2020/wordml/sdtdatahash" xmlns:w16sdtfl="http://schemas.microsoft.com/office/word/2024/wordml/sdtformatlock" xmlns:w16se="http://schemas.microsoft.com/office/word/2015/wordml/symex" xmlns:wpg="http://schemas.microsoft.com/office/word/2010/wordprocessingGroup" xmlns:wpi="http://schemas.microsoft.com/office/word/2010/wordprocessingInk" xmlns:wne="http://schemas.microsoft.com/office/word/2006/wordml" xmlns:wps="http://schemas.microsoft.com/office/word/2010/wordprocessingShape" mc:Ignorable="w14 w15 w16se w16cid w16 w16cex w16sdtdh w16sdtfl w16du wp14">
-  <w:comment w:id="4" w:author="Autor" w:initials="A">
+  <w:comment w:id="0" w:author="Autor" w:initials="A">
+    <w:p>
+      <w:pPr>
+        <w:jc w:val="left"/>
+      </w:pPr>
+      <w:r>
+        <w:rPr>
+          <w:rStyle w:val="Refdecomentrio"/>
+        </w:rPr>
+        <w:annotationRef/>
+      </w:r>
+      <w:r>
+        <w:rPr>
+          <w:sz w:val="20"/>
+        </w:rPr>
+        <w:t>Deletar ao finalizar o preenchimento do manuscrito.</w:t>
+      </w:r>
+    </w:p>
+  </w:comment>
+  <w:comment w:id="5" w:author="Autor" w:initials="A">
     <w:p>
       <w:pPr>
         <w:jc w:val="left"/>
@@ -7020,12 +7090,14 @@
 
 <file path=word/commentsExtended.xml><?xml version="1.0" encoding="utf-8"?>
 <w15:commentsEx xmlns:wpc="http://schemas.microsoft.com/office/word/2010/wordprocessingCanvas" xmlns:cx="http://schemas.microsoft.com/office/drawing/2014/chartex" xmlns:cx1="http://schemas.microsoft.com/office/drawing/2015/9/8/chartex" xmlns:cx2="http://schemas.microsoft.com/office/drawing/2015/10/21/chartex" xmlns:cx3="http://schemas.microsoft.com/office/drawing/2016/5/9/chartex" xmlns:cx4="http://schemas.microsoft.com/office/drawing/2016/5/10/chartex" xmlns:cx5="http://schemas.microsoft.com/office/drawing/2016/5/11/chartex" xmlns:cx6="http://schemas.microsoft.com/office/drawing/2016/5/12/chartex" xmlns:cx7="http://schemas.microsoft.com/office/drawing/2016/5/13/chartex" xmlns:cx8="http://schemas.microsoft.com/office/drawing/2016/5/14/chartex" xmlns:mc="http://schemas.openxmlformats.org/markup-compatibility/2006" xmlns:aink="http://schemas.microsoft.com/office/drawing/2016/ink" xmlns:am3d="http://schemas.microsoft.com/office/drawing/2017/model3d" xmlns:o="urn:schemas-microsoft-com:office:office" xmlns:oel="http://schemas.microsoft.com/office/2019/extlst" xmlns:r="http://schemas.openxmlformats.org/officeDocument/2006/relationships" xmlns:m="http://schemas.openxmlformats.org/officeDocument/2006/math" xmlns:v="urn:schemas-microsoft-com:vml" xmlns:wp14="http://schemas.microsoft.com/office/word/2010/wordprocessingDrawing" xmlns:wp="http://schemas.openxmlformats.org/drawingml/2006/wordprocessingDrawing" xmlns:w10="urn:schemas-microsoft-com:office:word" xmlns:w="http://schemas.openxmlformats.org/wordprocessingml/2006/main" xmlns:w14="http://schemas.microsoft.com/office/word/2010/wordml" xmlns:w15="http://schemas.microsoft.com/office/word/2012/wordml" xmlns:w16cex="http://schemas.microsoft.com/office/word/2018/wordml/cex" xmlns:w16cid="http://schemas.microsoft.com/office/word/2016/wordml/cid" xmlns:w16="http://schemas.microsoft.com/office/word/2018/wordml" xmlns:w16du="http://schemas.microsoft.com/office/word/2023/wordml/word16du" xmlns:w16sdtdh="http://schemas.microsoft.com/office/word/2020/wordml/sdtdatahash" xmlns:w16sdtfl="http://schemas.microsoft.com/office/word/2024/wordml/sdtformatlock" xmlns:w16se="http://schemas.microsoft.com/office/word/2015/wordml/symex" xmlns:wpg="http://schemas.microsoft.com/office/word/2010/wordprocessingGroup" xmlns:wpi="http://schemas.microsoft.com/office/word/2010/wordprocessingInk" xmlns:wne="http://schemas.microsoft.com/office/word/2006/wordml" xmlns:wps="http://schemas.microsoft.com/office/word/2010/wordprocessingShape" mc:Ignorable="w14 w15 w16se w16cid w16 w16cex w16sdtdh w16sdtfl w16du wp14">
+  <w15:commentEx w15:paraId="0748B5A2" w15:done="0"/>
   <w15:commentEx w15:paraId="3A284AFC" w15:done="0"/>
 </w15:commentsEx>
 </file>
 
 <file path=word/commentsIds.xml><?xml version="1.0" encoding="utf-8"?>
 <w16cid:commentsIds xmlns:wpc="http://schemas.microsoft.com/office/word/2010/wordprocessingCanvas" xmlns:cx="http://schemas.microsoft.com/office/drawing/2014/chartex" xmlns:cx1="http://schemas.microsoft.com/office/drawing/2015/9/8/chartex" xmlns:cx2="http://schemas.microsoft.com/office/drawing/2015/10/21/chartex" xmlns:cx3="http://schemas.microsoft.com/office/drawing/2016/5/9/chartex" xmlns:cx4="http://schemas.microsoft.com/office/drawing/2016/5/10/chartex" xmlns:cx5="http://schemas.microsoft.com/office/drawing/2016/5/11/chartex" xmlns:cx6="http://schemas.microsoft.com/office/drawing/2016/5/12/chartex" xmlns:cx7="http://schemas.microsoft.com/office/drawing/2016/5/13/chartex" xmlns:cx8="http://schemas.microsoft.com/office/drawing/2016/5/14/chartex" xmlns:mc="http://schemas.openxmlformats.org/markup-compatibility/2006" xmlns:aink="http://schemas.microsoft.com/office/drawing/2016/ink" xmlns:am3d="http://schemas.microsoft.com/office/drawing/2017/model3d" xmlns:o="urn:schemas-microsoft-com:office:office" xmlns:oel="http://schemas.microsoft.com/office/2019/extlst" xmlns:r="http://schemas.openxmlformats.org/officeDocument/2006/relationships" xmlns:m="http://schemas.openxmlformats.org/officeDocument/2006/math" xmlns:v="urn:schemas-microsoft-com:vml" xmlns:wp14="http://schemas.microsoft.com/office/word/2010/wordprocessingDrawing" xmlns:wp="http://schemas.openxmlformats.org/drawingml/2006/wordprocessingDrawing" xmlns:w10="urn:schemas-microsoft-com:office:word" xmlns:w="http://schemas.openxmlformats.org/wordprocessingml/2006/main" xmlns:w14="http://schemas.microsoft.com/office/word/2010/wordml" xmlns:w15="http://schemas.microsoft.com/office/word/2012/wordml" xmlns:w16cex="http://schemas.microsoft.com/office/word/2018/wordml/cex" xmlns:w16cid="http://schemas.microsoft.com/office/word/2016/wordml/cid" xmlns:w16="http://schemas.microsoft.com/office/word/2018/wordml" xmlns:w16du="http://schemas.microsoft.com/office/word/2023/wordml/word16du" xmlns:w16sdtdh="http://schemas.microsoft.com/office/word/2020/wordml/sdtdatahash" xmlns:w16sdtfl="http://schemas.microsoft.com/office/word/2024/wordml/sdtformatlock" xmlns:w16se="http://schemas.microsoft.com/office/word/2015/wordml/symex" xmlns:wpg="http://schemas.microsoft.com/office/word/2010/wordprocessingGroup" xmlns:wpi="http://schemas.microsoft.com/office/word/2010/wordprocessingInk" xmlns:wne="http://schemas.microsoft.com/office/word/2006/wordml" xmlns:wps="http://schemas.microsoft.com/office/word/2010/wordprocessingShape" mc:Ignorable="w14 w15 w16se w16cid w16 w16cex w16sdtdh w16sdtfl w16du wp14">
+  <w16cid:commentId w16cid:paraId="0748B5A2" w16cid:durableId="29F921A4"/>
   <w16cid:commentId w16cid:paraId="3A284AFC" w16cid:durableId="351C48A2"/>
 </w16cid:commentsIds>
 </file>
@@ -10647,6 +10719,23 @@
       <w:sz w:val="18"/>
     </w:rPr>
   </w:style>
+  <w:style w:type="paragraph" w:customStyle="1" w:styleId="RA37citaorecuada">
+    <w:name w:val="RA_3.7_citaçãorecuada"/>
+    <w:basedOn w:val="RA31text"/>
+    <w:next w:val="RA31text"/>
+    <w:qFormat/>
+    <w:rsid w:val="001444F5"/>
+    <w:pPr>
+      <w:spacing w:before="120" w:after="120" w:line="240" w:lineRule="auto"/>
+      <w:ind w:left="2268" w:firstLine="0"/>
+      <w:contextualSpacing/>
+    </w:pPr>
+    <w:rPr>
+      <w:color w:val="auto"/>
+      <w:sz w:val="18"/>
+      <w:lang w:val="pt-BR"/>
+    </w:rPr>
+  </w:style>
 </w:styles>
 </file>
 

</xml_diff>